<commit_message>
New work with APIs
</commit_message>
<xml_diff>
--- a/PDF/Documantation/ch1/Chapter 1.docx
+++ b/PDF/Documantation/ch1/Chapter 1.docx
@@ -1,6 +1,6 @@
 
 <file path=word/document.xml><?xml version="1.0" encoding="utf-8"?>
-<w:document xmlns:wpc="http://schemas.microsoft.com/office/word/2010/wordprocessingCanvas" xmlns:cx="http://schemas.microsoft.com/office/drawing/2014/chartex" xmlns:cx1="http://schemas.microsoft.com/office/drawing/2015/9/8/chartex" xmlns:cx2="http://schemas.microsoft.com/office/drawing/2015/10/21/chartex" xmlns:cx3="http://schemas.microsoft.com/office/drawing/2016/5/9/chartex" xmlns:cx4="http://schemas.microsoft.com/office/drawing/2016/5/10/chartex" xmlns:cx5="http://schemas.microsoft.com/office/drawing/2016/5/11/chartex" xmlns:cx6="http://schemas.microsoft.com/office/drawing/2016/5/12/chartex" xmlns:cx7="http://schemas.microsoft.com/office/drawing/2016/5/13/chartex" xmlns:cx8="http://schemas.microsoft.com/office/drawing/2016/5/14/chartex" xmlns:mc="http://schemas.openxmlformats.org/markup-compatibility/2006" xmlns:aink="http://schemas.microsoft.com/office/drawing/2016/ink" xmlns:am3d="http://schemas.microsoft.com/office/drawing/2017/model3d" xmlns:o="urn:schemas-microsoft-com:office:office" xmlns:oel="http://schemas.microsoft.com/office/2019/extlst" xmlns:r="http://schemas.openxmlformats.org/officeDocument/2006/relationships" xmlns:m="http://schemas.openxmlformats.org/officeDocument/2006/math" xmlns:v="urn:schemas-microsoft-com:vml" xmlns:wp14="http://schemas.microsoft.com/office/word/2010/wordprocessingDrawing" xmlns:wp="http://schemas.openxmlformats.org/drawingml/2006/wordprocessingDrawing" xmlns:w10="urn:schemas-microsoft-com:office:word" xmlns:w="http://schemas.openxmlformats.org/wordprocessingml/2006/main" xmlns:w14="http://schemas.microsoft.com/office/word/2010/wordml" xmlns:w15="http://schemas.microsoft.com/office/word/2012/wordml" xmlns:w16cex="http://schemas.microsoft.com/office/word/2018/wordml/cex" xmlns:w16cid="http://schemas.microsoft.com/office/word/2016/wordml/cid" xmlns:w16="http://schemas.microsoft.com/office/word/2018/wordml" xmlns:w16du="http://schemas.microsoft.com/office/word/2023/wordml/word16du" xmlns:w16sdtdh="http://schemas.microsoft.com/office/word/2020/wordml/sdtdatahash" xmlns:w16se="http://schemas.microsoft.com/office/word/2015/wordml/symex" xmlns:wpg="http://schemas.microsoft.com/office/word/2010/wordprocessingGroup" xmlns:wpi="http://schemas.microsoft.com/office/word/2010/wordprocessingInk" xmlns:wne="http://schemas.microsoft.com/office/word/2006/wordml" xmlns:wps="http://schemas.microsoft.com/office/word/2010/wordprocessingShape" mc:Ignorable="w14 w15 w16se w16cid w16 w16cex w16sdtdh wp14">
+<w:document xmlns:wpc="http://schemas.microsoft.com/office/word/2010/wordprocessingCanvas" xmlns:cx="http://schemas.microsoft.com/office/drawing/2014/chartex" xmlns:cx1="http://schemas.microsoft.com/office/drawing/2015/9/8/chartex" xmlns:cx2="http://schemas.microsoft.com/office/drawing/2015/10/21/chartex" xmlns:cx3="http://schemas.microsoft.com/office/drawing/2016/5/9/chartex" xmlns:cx4="http://schemas.microsoft.com/office/drawing/2016/5/10/chartex" xmlns:cx5="http://schemas.microsoft.com/office/drawing/2016/5/11/chartex" xmlns:cx6="http://schemas.microsoft.com/office/drawing/2016/5/12/chartex" xmlns:cx7="http://schemas.microsoft.com/office/drawing/2016/5/13/chartex" xmlns:cx8="http://schemas.microsoft.com/office/drawing/2016/5/14/chartex" xmlns:mc="http://schemas.openxmlformats.org/markup-compatibility/2006" xmlns:aink="http://schemas.microsoft.com/office/drawing/2016/ink" xmlns:am3d="http://schemas.microsoft.com/office/drawing/2017/model3d" xmlns:o="urn:schemas-microsoft-com:office:office" xmlns:oel="http://schemas.microsoft.com/office/2019/extlst" xmlns:r="http://schemas.openxmlformats.org/officeDocument/2006/relationships" xmlns:m="http://schemas.openxmlformats.org/officeDocument/2006/math" xmlns:v="urn:schemas-microsoft-com:vml" xmlns:wp14="http://schemas.microsoft.com/office/word/2010/wordprocessingDrawing" xmlns:wp="http://schemas.openxmlformats.org/drawingml/2006/wordprocessingDrawing" xmlns:w10="urn:schemas-microsoft-com:office:word" xmlns:w="http://schemas.openxmlformats.org/wordprocessingml/2006/main" xmlns:w14="http://schemas.microsoft.com/office/word/2010/wordml" xmlns:w15="http://schemas.microsoft.com/office/word/2012/wordml" xmlns:w16cex="http://schemas.microsoft.com/office/word/2018/wordml/cex" xmlns:w16cid="http://schemas.microsoft.com/office/word/2016/wordml/cid" xmlns:w16="http://schemas.microsoft.com/office/word/2018/wordml" xmlns:w16du="http://schemas.microsoft.com/office/word/2023/wordml/word16du" xmlns:w16sdtdh="http://schemas.microsoft.com/office/word/2020/wordml/sdtdatahash" xmlns:w16sdtfl="http://schemas.microsoft.com/office/word/2024/wordml/sdtformatlock" xmlns:w16se="http://schemas.microsoft.com/office/word/2015/wordml/symex" xmlns:wpg="http://schemas.microsoft.com/office/word/2010/wordprocessingGroup" xmlns:wpi="http://schemas.microsoft.com/office/word/2010/wordprocessingInk" xmlns:wne="http://schemas.microsoft.com/office/word/2006/wordml" xmlns:wps="http://schemas.microsoft.com/office/word/2010/wordprocessingShape" mc:Ignorable="w14 w15 w16se w16cid w16 w16cex w16sdtdh w16sdtfl w16du wp14">
   <w:body>
     <w:p>
       <w:pPr>
@@ -2173,27 +2173,7 @@
           <w:szCs w:val="24"/>
           <w:lang w:bidi="ar-JO"/>
         </w:rPr>
-        <w:t xml:space="preserve"> supports multiple languages and provides features like voice customization, lip-sync adjustment, and batch processing. However, the platform primarily focuses on commercial and marketing content rather than specialized educational </w:t>
-      </w:r>
-      <w:proofErr w:type="gramStart"/>
-      <w:r>
-        <w:rPr>
-          <w:rFonts w:asciiTheme="majorBidi" w:hAnsiTheme="majorBidi" w:cstheme="majorBidi"/>
-          <w:sz w:val="24"/>
-          <w:szCs w:val="24"/>
-          <w:lang w:bidi="ar-JO"/>
-        </w:rPr>
-        <w:t>material, and</w:t>
-      </w:r>
-      <w:proofErr w:type="gramEnd"/>
-      <w:r>
-        <w:rPr>
-          <w:rFonts w:asciiTheme="majorBidi" w:hAnsiTheme="majorBidi" w:cstheme="majorBidi"/>
-          <w:sz w:val="24"/>
-          <w:szCs w:val="24"/>
-          <w:lang w:bidi="ar-JO"/>
-        </w:rPr>
-        <w:t xml:space="preserve"> lacks educational-specific features like terminology preservation and interactive learning tools.</w:t>
+        <w:t xml:space="preserve"> supports multiple languages and provides features like voice customization, lip-sync adjustment, and batch processing. However, the platform primarily focuses on commercial and marketing content rather than specialized educational material, and lacks educational-specific features like terminology preservation and interactive learning tools.</w:t>
       </w:r>
     </w:p>
     <w:p>
@@ -2685,47 +2665,38 @@
           <w:rFonts w:asciiTheme="majorBidi" w:hAnsiTheme="majorBidi" w:cstheme="majorBidi"/>
           <w:sz w:val="24"/>
           <w:szCs w:val="24"/>
-          <w:lang w:bidi="ar-JO"/>
-        </w:rPr>
-      </w:pPr>
-    </w:p>
-    <w:p>
-      <w:pPr>
-        <w:rPr>
-          <w:rFonts w:asciiTheme="majorBidi" w:hAnsiTheme="majorBidi" w:cstheme="majorBidi"/>
-          <w:sz w:val="24"/>
-          <w:szCs w:val="24"/>
-          <w:lang w:bidi="ar-JO"/>
-        </w:rPr>
-      </w:pPr>
-      <w:proofErr w:type="spellStart"/>
-      <w:r>
-        <w:rPr>
-          <w:rFonts w:asciiTheme="majorBidi" w:hAnsiTheme="majorBidi" w:cstheme="majorBidi"/>
-          <w:sz w:val="24"/>
-          <w:szCs w:val="24"/>
-          <w:lang w:bidi="ar-JO"/>
-        </w:rPr>
-        <w:t>Papercup</w:t>
-      </w:r>
-      <w:proofErr w:type="spellEnd"/>
-      <w:r>
-        <w:rPr>
-          <w:rFonts w:asciiTheme="majorBidi" w:hAnsiTheme="majorBidi" w:cstheme="majorBidi"/>
-          <w:sz w:val="24"/>
-          <w:szCs w:val="24"/>
-          <w:lang w:bidi="ar-JO"/>
-        </w:rPr>
-        <w:t xml:space="preserve"> AI:</w:t>
-      </w:r>
-    </w:p>
-    <w:p>
-      <w:pPr>
-        <w:rPr>
-          <w:rFonts w:asciiTheme="majorBidi" w:hAnsiTheme="majorBidi" w:cstheme="majorBidi"/>
-          <w:sz w:val="24"/>
-          <w:szCs w:val="24"/>
           <w:rtl/>
+          <w:lang w:bidi="ar-JO"/>
+        </w:rPr>
+      </w:pPr>
+    </w:p>
+    <w:p>
+      <w:pPr>
+        <w:rPr>
+          <w:rFonts w:asciiTheme="majorBidi" w:hAnsiTheme="majorBidi" w:cstheme="majorBidi"/>
+          <w:sz w:val="24"/>
+          <w:szCs w:val="24"/>
+          <w:rtl/>
+          <w:lang w:bidi="ar-JO"/>
+        </w:rPr>
+      </w:pPr>
+    </w:p>
+    <w:p>
+      <w:pPr>
+        <w:rPr>
+          <w:rFonts w:asciiTheme="majorBidi" w:hAnsiTheme="majorBidi" w:cstheme="majorBidi"/>
+          <w:sz w:val="24"/>
+          <w:szCs w:val="24"/>
+          <w:lang w:bidi="ar-JO"/>
+        </w:rPr>
+      </w:pPr>
+    </w:p>
+    <w:p>
+      <w:pPr>
+        <w:rPr>
+          <w:rFonts w:asciiTheme="majorBidi" w:hAnsiTheme="majorBidi" w:cstheme="majorBidi"/>
+          <w:sz w:val="24"/>
+          <w:szCs w:val="24"/>
           <w:lang w:bidi="ar-JO"/>
         </w:rPr>
       </w:pPr>
@@ -2748,6 +2719,37 @@
           <w:szCs w:val="24"/>
           <w:lang w:bidi="ar-JO"/>
         </w:rPr>
+        <w:t xml:space="preserve"> AI:</w:t>
+      </w:r>
+    </w:p>
+    <w:p>
+      <w:pPr>
+        <w:rPr>
+          <w:rFonts w:asciiTheme="majorBidi" w:hAnsiTheme="majorBidi" w:cstheme="majorBidi"/>
+          <w:sz w:val="24"/>
+          <w:szCs w:val="24"/>
+          <w:rtl/>
+          <w:lang w:bidi="ar-JO"/>
+        </w:rPr>
+      </w:pPr>
+      <w:proofErr w:type="spellStart"/>
+      <w:r>
+        <w:rPr>
+          <w:rFonts w:asciiTheme="majorBidi" w:hAnsiTheme="majorBidi" w:cstheme="majorBidi"/>
+          <w:sz w:val="24"/>
+          <w:szCs w:val="24"/>
+          <w:lang w:bidi="ar-JO"/>
+        </w:rPr>
+        <w:t>Papercup</w:t>
+      </w:r>
+      <w:proofErr w:type="spellEnd"/>
+      <w:r>
+        <w:rPr>
+          <w:rFonts w:asciiTheme="majorBidi" w:hAnsiTheme="majorBidi" w:cstheme="majorBidi"/>
+          <w:sz w:val="24"/>
+          <w:szCs w:val="24"/>
+          <w:lang w:bidi="ar-JO"/>
+        </w:rPr>
         <w:t xml:space="preserve"> provides AI dubbing services primarily for media companies and content creators. The platform uses advanced neural networks to generate dubbed audio while attempting to maintain emotional tone and speaking style. However, the service is designed for entertainment and news content rather than educational material.</w:t>
       </w:r>
     </w:p>
@@ -2759,20 +2761,6 @@
           <w:rFonts w:asciiTheme="majorBidi" w:hAnsiTheme="majorBidi" w:cstheme="majorBidi"/>
           <w:sz w:val="24"/>
           <w:szCs w:val="24"/>
-          <w:rtl/>
-          <w:lang w:bidi="ar-JO"/>
-        </w:rPr>
-      </w:pPr>
-    </w:p>
-    <w:p>
-      <w:pPr>
-        <w:pStyle w:val="ListParagraph"/>
-        <w:ind w:left="1080"/>
-        <w:rPr>
-          <w:rFonts w:asciiTheme="majorBidi" w:hAnsiTheme="majorBidi" w:cstheme="majorBidi"/>
-          <w:sz w:val="24"/>
-          <w:szCs w:val="24"/>
-          <w:rtl/>
           <w:lang w:bidi="ar-JO"/>
         </w:rPr>
       </w:pPr>
@@ -3399,27 +3387,7 @@
           <w:szCs w:val="24"/>
           <w:lang w:bidi="ar-JO"/>
         </w:rPr>
-        <w:t xml:space="preserve">These identified limitations collectively demonstrate a significant gap in the current market for a comprehensive, </w:t>
-      </w:r>
-      <w:proofErr w:type="gramStart"/>
-      <w:r>
-        <w:rPr>
-          <w:rFonts w:asciiTheme="majorBidi" w:hAnsiTheme="majorBidi" w:cstheme="majorBidi"/>
-          <w:sz w:val="24"/>
-          <w:szCs w:val="24"/>
-          <w:lang w:bidi="ar-JO"/>
-        </w:rPr>
-        <w:t>educationally-focused</w:t>
-      </w:r>
-      <w:proofErr w:type="gramEnd"/>
-      <w:r>
-        <w:rPr>
-          <w:rFonts w:asciiTheme="majorBidi" w:hAnsiTheme="majorBidi" w:cstheme="majorBidi"/>
-          <w:sz w:val="24"/>
-          <w:szCs w:val="24"/>
-          <w:lang w:bidi="ar-JO"/>
-        </w:rPr>
-        <w:t xml:space="preserve">, AI-powered video dubbing platform specifically designed for Arabic-speaking learners. The </w:t>
+        <w:t xml:space="preserve">These identified limitations collectively demonstrate a significant gap in the current market for a comprehensive, educationally-focused, AI-powered video dubbing platform specifically designed for Arabic-speaking learners. The </w:t>
       </w:r>
       <w:proofErr w:type="spellStart"/>
       <w:r>
@@ -3453,7 +3421,7 @@
 </file>
 
 <file path=word/numbering.xml><?xml version="1.0" encoding="utf-8"?>
-<w:numbering xmlns:wpc="http://schemas.microsoft.com/office/word/2010/wordprocessingCanvas" xmlns:cx="http://schemas.microsoft.com/office/drawing/2014/chartex" xmlns:cx1="http://schemas.microsoft.com/office/drawing/2015/9/8/chartex" xmlns:cx2="http://schemas.microsoft.com/office/drawing/2015/10/21/chartex" xmlns:cx3="http://schemas.microsoft.com/office/drawing/2016/5/9/chartex" xmlns:cx4="http://schemas.microsoft.com/office/drawing/2016/5/10/chartex" xmlns:cx5="http://schemas.microsoft.com/office/drawing/2016/5/11/chartex" xmlns:cx6="http://schemas.microsoft.com/office/drawing/2016/5/12/chartex" xmlns:cx7="http://schemas.microsoft.com/office/drawing/2016/5/13/chartex" xmlns:cx8="http://schemas.microsoft.com/office/drawing/2016/5/14/chartex" xmlns:mc="http://schemas.openxmlformats.org/markup-compatibility/2006" xmlns:aink="http://schemas.microsoft.com/office/drawing/2016/ink" xmlns:am3d="http://schemas.microsoft.com/office/drawing/2017/model3d" xmlns:o="urn:schemas-microsoft-com:office:office" xmlns:oel="http://schemas.microsoft.com/office/2019/extlst" xmlns:r="http://schemas.openxmlformats.org/officeDocument/2006/relationships" xmlns:m="http://schemas.openxmlformats.org/officeDocument/2006/math" xmlns:v="urn:schemas-microsoft-com:vml" xmlns:wp14="http://schemas.microsoft.com/office/word/2010/wordprocessingDrawing" xmlns:wp="http://schemas.openxmlformats.org/drawingml/2006/wordprocessingDrawing" xmlns:w10="urn:schemas-microsoft-com:office:word" xmlns:w="http://schemas.openxmlformats.org/wordprocessingml/2006/main" xmlns:w14="http://schemas.microsoft.com/office/word/2010/wordml" xmlns:w15="http://schemas.microsoft.com/office/word/2012/wordml" xmlns:w16cex="http://schemas.microsoft.com/office/word/2018/wordml/cex" xmlns:w16cid="http://schemas.microsoft.com/office/word/2016/wordml/cid" xmlns:w16="http://schemas.microsoft.com/office/word/2018/wordml" xmlns:w16du="http://schemas.microsoft.com/office/word/2023/wordml/word16du" xmlns:w16sdtdh="http://schemas.microsoft.com/office/word/2020/wordml/sdtdatahash" xmlns:w16se="http://schemas.microsoft.com/office/word/2015/wordml/symex" xmlns:wpg="http://schemas.microsoft.com/office/word/2010/wordprocessingGroup" xmlns:wpi="http://schemas.microsoft.com/office/word/2010/wordprocessingInk" xmlns:wne="http://schemas.microsoft.com/office/word/2006/wordml" xmlns:wps="http://schemas.microsoft.com/office/word/2010/wordprocessingShape" mc:Ignorable="w14 w15 w16se w16cid w16 w16cex w16sdtdh wp14">
+<w:numbering xmlns:wpc="http://schemas.microsoft.com/office/word/2010/wordprocessingCanvas" xmlns:cx="http://schemas.microsoft.com/office/drawing/2014/chartex" xmlns:cx1="http://schemas.microsoft.com/office/drawing/2015/9/8/chartex" xmlns:cx2="http://schemas.microsoft.com/office/drawing/2015/10/21/chartex" xmlns:cx3="http://schemas.microsoft.com/office/drawing/2016/5/9/chartex" xmlns:cx4="http://schemas.microsoft.com/office/drawing/2016/5/10/chartex" xmlns:cx5="http://schemas.microsoft.com/office/drawing/2016/5/11/chartex" xmlns:cx6="http://schemas.microsoft.com/office/drawing/2016/5/12/chartex" xmlns:cx7="http://schemas.microsoft.com/office/drawing/2016/5/13/chartex" xmlns:cx8="http://schemas.microsoft.com/office/drawing/2016/5/14/chartex" xmlns:mc="http://schemas.openxmlformats.org/markup-compatibility/2006" xmlns:aink="http://schemas.microsoft.com/office/drawing/2016/ink" xmlns:am3d="http://schemas.microsoft.com/office/drawing/2017/model3d" xmlns:o="urn:schemas-microsoft-com:office:office" xmlns:oel="http://schemas.microsoft.com/office/2019/extlst" xmlns:r="http://schemas.openxmlformats.org/officeDocument/2006/relationships" xmlns:m="http://schemas.openxmlformats.org/officeDocument/2006/math" xmlns:v="urn:schemas-microsoft-com:vml" xmlns:wp14="http://schemas.microsoft.com/office/word/2010/wordprocessingDrawing" xmlns:wp="http://schemas.openxmlformats.org/drawingml/2006/wordprocessingDrawing" xmlns:w10="urn:schemas-microsoft-com:office:word" xmlns:w="http://schemas.openxmlformats.org/wordprocessingml/2006/main" xmlns:w14="http://schemas.microsoft.com/office/word/2010/wordml" xmlns:w15="http://schemas.microsoft.com/office/word/2012/wordml" xmlns:w16cex="http://schemas.microsoft.com/office/word/2018/wordml/cex" xmlns:w16cid="http://schemas.microsoft.com/office/word/2016/wordml/cid" xmlns:w16="http://schemas.microsoft.com/office/word/2018/wordml" xmlns:w16du="http://schemas.microsoft.com/office/word/2023/wordml/word16du" xmlns:w16sdtdh="http://schemas.microsoft.com/office/word/2020/wordml/sdtdatahash" xmlns:w16sdtfl="http://schemas.microsoft.com/office/word/2024/wordml/sdtformatlock" xmlns:w16se="http://schemas.microsoft.com/office/word/2015/wordml/symex" xmlns:wpg="http://schemas.microsoft.com/office/word/2010/wordprocessingGroup" xmlns:wpi="http://schemas.microsoft.com/office/word/2010/wordprocessingInk" xmlns:wne="http://schemas.microsoft.com/office/word/2006/wordml" xmlns:wps="http://schemas.microsoft.com/office/word/2010/wordprocessingShape" mc:Ignorable="w14 w15 w16se w16cid w16 w16cex w16sdtdh w16sdtfl w16du wp14">
   <w:abstractNum w:abstractNumId="0" w15:restartNumberingAfterBreak="0">
     <w:nsid w:val="06813946"/>
     <w:multiLevelType w:val="multilevel"/>
@@ -4246,7 +4214,7 @@
 </file>
 
 <file path=word/styles.xml><?xml version="1.0" encoding="utf-8"?>
-<w:styles xmlns:mc="http://schemas.openxmlformats.org/markup-compatibility/2006" xmlns:r="http://schemas.openxmlformats.org/officeDocument/2006/relationships" xmlns:w="http://schemas.openxmlformats.org/wordprocessingml/2006/main" xmlns:w14="http://schemas.microsoft.com/office/word/2010/wordml" xmlns:w15="http://schemas.microsoft.com/office/word/2012/wordml" xmlns:w16cex="http://schemas.microsoft.com/office/word/2018/wordml/cex" xmlns:w16cid="http://schemas.microsoft.com/office/word/2016/wordml/cid" xmlns:w16="http://schemas.microsoft.com/office/word/2018/wordml" xmlns:w16sdtdh="http://schemas.microsoft.com/office/word/2020/wordml/sdtdatahash" xmlns:w16se="http://schemas.microsoft.com/office/word/2015/wordml/symex" mc:Ignorable="w14 w15 w16se w16cid w16 w16cex w16sdtdh">
+<w:styles xmlns:mc="http://schemas.openxmlformats.org/markup-compatibility/2006" xmlns:r="http://schemas.openxmlformats.org/officeDocument/2006/relationships" xmlns:w="http://schemas.openxmlformats.org/wordprocessingml/2006/main" xmlns:w14="http://schemas.microsoft.com/office/word/2010/wordml" xmlns:w15="http://schemas.microsoft.com/office/word/2012/wordml" xmlns:w16cex="http://schemas.microsoft.com/office/word/2018/wordml/cex" xmlns:w16cid="http://schemas.microsoft.com/office/word/2016/wordml/cid" xmlns:w16="http://schemas.microsoft.com/office/word/2018/wordml" xmlns:w16du="http://schemas.microsoft.com/office/word/2023/wordml/word16du" xmlns:w16sdtdh="http://schemas.microsoft.com/office/word/2020/wordml/sdtdatahash" xmlns:w16sdtfl="http://schemas.microsoft.com/office/word/2024/wordml/sdtformatlock" xmlns:w16se="http://schemas.microsoft.com/office/word/2015/wordml/symex" mc:Ignorable="w14 w15 w16se w16cid w16 w16cex w16sdtdh w16sdtfl w16du">
   <w:docDefaults>
     <w:rPrDefault>
       <w:rPr>

</xml_diff>